<commit_message>
Goalie 62.5/37.5 validated; pricing document's goalie section updated
The refresh at 9952a5d passed: the parity rebuild and raw guards hold, the
live goalie line moved to 1.394% + 1.055% per WAR, lambda stayed 0.65, and
skater values are unchanged. The document now states the 62.5/37.5 weights
and the refitted line.

Co-Authored-By: Claude Opus 5.5 <noreply@anthropic.com>
Claude-Session: https://claude.ai/code/session_01KJQGvXbJQHJSXYBMj2qArp
</commit_message>
<xml_diff>
--- a/40_DOCS/Supervisor_Drafts/Pricing, Control Years, and Contract Value.docx
+++ b/40_DOCS/Supervisor_Drafts/Pricing, Control Years, and Contract Value.docx
@@ -7227,7 +7227,7 @@
         <w:rPr>
           <w:rFonts w:asciiTheme="minorHAnsi" w:hAnsiTheme="minorHAnsi" w:cstheme="minorHAnsi"/>
         </w:rPr>
-        <w:t xml:space="preserve">The calculation starts with a weighted average of the goalie’s previous three seasons: 50% on the most recent, 30% on the second, and 20% on the third. With only two seasons, the weights become 60% and 40%; with only the preceding season, that season supplies the baseline. These calculations require the immediately preceding season, although a separate carry-back rule can recover an older baseline, within three seasons, when recent history is missing. A goalie on a carried-back baseline is pulled toward 0.65 WAR, the average of such goalies who played again, and his value is weighted by 0.312, the share of them who did. The skater requirement of at least ten games does not apply.</w:t>
+        <w:t xml:space="preserve">The calculation starts with a weighted average of the goalie’s previous three seasons: 50% on the most recent, 30% on the second, and 20% on the third. With only two seasons, the 50% and 30% are rescaled to 62.5% and 37.5%, as for skaters; with only the preceding season, that season supplies the baseline. These calculations require the immediately preceding season, although a separate carry-back rule can recover an older baseline, within three seasons, when recent history is missing. A goalie on a carried-back baseline is pulled toward 0.65 WAR, the average of such goalies who played again, and his value is weighted by 0.312, the share of them who did. The skater requirement of at least ten games does not apply.</w:t>
       </w:r>
     </w:p>
     <w:p>
@@ -7266,7 +7266,7 @@
         <w:rPr>
           <w:rFonts w:asciiTheme="minorHAnsi" w:hAnsiTheme="minorHAnsi" w:cstheme="minorHAnsi"/>
         </w:rPr>
-        <w:t xml:space="preserve">The goalie price line assigns 1.391% of the cap at zero WAR, plus 1.059% of the cap per goalie WAR. It uses an ordinary least-squares regression, which fits salary to production without the skater line’s treatment of minimum-salary contracts, and it has no contract-length term. Goalie values apply the minimum without the uncertainty adjustment. Goalie control years are weighted by one pooled rate, measured as for skaters on goaltenders who played in the contract’s final season. Of 102 decisions, clubs qualified 90.2%, and 85.9% of those qualified played the next season, for a weight of 0.775 a year. The chain starts from his chance of reaching the contract’s final season. These differences limit comparability, even though both models express surplus in dollars.</w:t>
+        <w:t xml:space="preserve">The goalie price line assigns 1.394% of the cap at zero WAR, plus 1.055% of the cap per goalie WAR. It uses an ordinary least-squares regression, which fits salary to production without the skater line’s treatment of minimum-salary contracts, and it has no contract-length term. Goalie values apply the minimum without the uncertainty adjustment. Goalie control years are weighted by one pooled rate, measured as for skaters on goaltenders who played in the contract’s final season. Of 102 decisions, clubs qualified 90.2%, and 85.9% of those qualified played the next season, for a weight of 0.775 a year. The chain starts from his chance of reaching the contract’s final season. These differences limit comparability, even though both models express surplus in dollars.</w:t>
       </w:r>
     </w:p>
     <w:sectPr>

</xml_diff>